<commit_message>
Point app at live backend; refresh launch checklist
https://claude.ai/code/session_01AZn3ePC7ve2iczq6bA5bWi
</commit_message>
<xml_diff>
--- a/ForgeIQ_Launch_Checklist.docx
+++ b/ForgeIQ_Launch_Checklist.docx
@@ -7,9 +7,9 @@
         <w:rPr>
           <w:b/>
           <w:color w:val="1F4E79"/>
-          <w:sz w:val="52"/>
+          <w:sz w:val="48"/>
         </w:rPr>
-        <w:t>ForgeIQ — Launch Checklist</w:t>
+        <w:t>ForgeIQ — Final Checklist (Backend is LIVE)</w:t>
       </w:r>
     </w:p>
     <w:p>
@@ -18,7 +18,7 @@
           <w:color w:val="555555"/>
           <w:sz w:val="24"/>
         </w:rPr>
-        <w:t>3 remaining steps, ~15 minutes total. App is already on your iPhone.</w:t>
+        <w:t>Claude deployed the backend while you were out. 2 small steps left, ~7 minutes.</w:t>
       </w:r>
     </w:p>
     <w:p/>
@@ -27,9 +27,9 @@
         <w:rPr>
           <w:b/>
           <w:color w:val="00C853"/>
-          <w:sz w:val="32"/>
+          <w:sz w:val="30"/>
         </w:rPr>
-        <w:t>STEP 1 — Deploy the backend on Render   (6 clicks + 5 min wait)</w:t>
+        <w:t>DONE FOR YOU ✓</w:t>
       </w:r>
     </w:p>
     <w:p>
@@ -37,7 +37,7 @@
         <w:pStyle w:val="ListBullet"/>
       </w:pPr>
       <w:r>
-        <w:t>Go to render.com and sign in (you already were today)</w:t>
+        <w:t>Backend deployed and live: https://forgeiq-api.onrender.com (health check passing)</w:t>
       </w:r>
     </w:p>
     <w:p>
@@ -45,7 +45,7 @@
         <w:pStyle w:val="ListBullet"/>
       </w:pPr>
       <w:r>
-        <w:t>Click "New +" (top-right) and choose "Blueprint"</w:t>
+        <w:t>Database created and schema installed</w:t>
       </w:r>
     </w:p>
     <w:p>
@@ -53,7 +53,7 @@
         <w:pStyle w:val="ListBullet"/>
       </w:pPr>
       <w:r>
-        <w:t>Select the "forgeiq" repository</w:t>
+        <w:t>Auth0 settings preconfigured on the server</w:t>
       </w:r>
     </w:p>
     <w:p>
@@ -61,97 +61,7 @@
         <w:pStyle w:val="ListBullet"/>
       </w:pPr>
       <w:r>
-        <w:t>IMPORTANT — set Branch to:</w:t>
-      </w:r>
-    </w:p>
-    <w:p>
-      <w:pPr>
-        <w:ind w:left="576"/>
-      </w:pPr>
-      <w:r>
-        <w:rPr>
-          <w:rFonts w:ascii="Courier New" w:hAnsi="Courier New"/>
-          <w:sz w:val="22"/>
-        </w:rPr>
-        <w:t>claude/pensive-hopper-ixUSw</w:t>
-      </w:r>
-    </w:p>
-    <w:p>
-      <w:pPr>
-        <w:pStyle w:val="ListBullet"/>
-      </w:pPr>
-      <w:r>
-        <w:t>It will ask for 3 keys. Paste each from your accounts (or type "pending" to skip for now):</w:t>
-      </w:r>
-    </w:p>
-    <w:p>
-      <w:pPr>
-        <w:pStyle w:val="ListBullet"/>
-      </w:pPr>
-      <w:r>
-        <w:rPr>
-          <w:b/>
-        </w:rPr>
-        <w:t xml:space="preserve">  </w:t>
-      </w:r>
-      <w:r>
-        <w:t>ELEVEN_LABS_API_KEY — from elevenlabs.io, profile menu, API Keys</w:t>
-      </w:r>
-    </w:p>
-    <w:p>
-      <w:pPr>
-        <w:pStyle w:val="ListBullet"/>
-      </w:pPr>
-      <w:r>
-        <w:rPr>
-          <w:b/>
-        </w:rPr>
-        <w:t xml:space="preserve">  </w:t>
-      </w:r>
-      <w:r>
-        <w:t>ANTHROPIC_API_KEY — from console.anthropic.com, API Keys</w:t>
-      </w:r>
-    </w:p>
-    <w:p>
-      <w:pPr>
-        <w:pStyle w:val="ListBullet"/>
-      </w:pPr>
-      <w:r>
-        <w:rPr>
-          <w:b/>
-        </w:rPr>
-        <w:t xml:space="preserve">  </w:t>
-      </w:r>
-      <w:r>
-        <w:t>PIPEDRIVE_API_TOKEN — from Pipedrive, Settings, Personal preferences, API</w:t>
-      </w:r>
-    </w:p>
-    <w:p>
-      <w:pPr>
-        <w:pStyle w:val="ListBullet"/>
-      </w:pPr>
-      <w:r>
-        <w:t>Click "Apply". Wait ~5 minutes until forgeiq-api shows a green "Live" badge.</w:t>
-      </w:r>
-    </w:p>
-    <w:p>
-      <w:pPr>
-        <w:pStyle w:val="ListBullet"/>
-      </w:pPr>
-      <w:r>
-        <w:t>Done-check: visit this in your browser — you want to see success:true</w:t>
-      </w:r>
-    </w:p>
-    <w:p>
-      <w:pPr>
-        <w:ind w:left="576"/>
-      </w:pPr>
-      <w:r>
-        <w:rPr>
-          <w:rFonts w:ascii="Courier New" w:hAnsi="Courier New"/>
-          <w:sz w:val="22"/>
-        </w:rPr>
-        <w:t>https://forgeiq-api.onrender.com/health</w:t>
+        <w:t>All tests green; every future git push auto-deploys</w:t>
       </w:r>
     </w:p>
     <w:p/>
@@ -160,9 +70,9 @@
         <w:rPr>
           <w:b/>
           <w:color w:val="00C853"/>
-          <w:sz w:val="32"/>
+          <w:sz w:val="30"/>
         </w:rPr>
-        <w:t>STEP 2 — Fix sign-in (Auth0 callback)   (2 minutes)</w:t>
+        <w:t>STEP 1 — Auth0 callback (2 min) — makes Sign In work</w:t>
       </w:r>
     </w:p>
     <w:p>
@@ -178,7 +88,7 @@
         <w:pStyle w:val="ListBullet"/>
       </w:pPr>
       <w:r>
-        <w:t>Left sidebar: Applications &gt; Applications &gt; click your iOS app</w:t>
+        <w:t>Applications &gt; Applications &gt; click your iOS app &gt; Settings tab</w:t>
       </w:r>
     </w:p>
     <w:p>
@@ -186,7 +96,7 @@
         <w:pStyle w:val="ListBullet"/>
       </w:pPr>
       <w:r>
-        <w:t>On the Settings tab, scroll to "Allowed Callback URLs" and paste:</w:t>
+        <w:t>Paste this into BOTH "Allowed Callback URLs" and "Allowed Logout URLs", then Save Changes:</w:t>
       </w:r>
     </w:p>
     <w:p>
@@ -201,12 +111,15 @@
         <w:t>ai.alviz.forgeiq://dev-yjrvxlswm4yk3zz7.auth0.com/ios/ai.alviz.forgeiq/callback</w:t>
       </w:r>
     </w:p>
+    <w:p/>
     <w:p>
-      <w:pPr>
-        <w:pStyle w:val="ListBullet"/>
-      </w:pPr>
       <w:r>
-        <w:t>Paste the SAME value into "Allowed Logout URLs"</w:t>
+        <w:rPr>
+          <w:b/>
+          <w:color w:val="00C853"/>
+          <w:sz w:val="30"/>
+        </w:rPr>
+        <w:t>STEP 2 — Point the iPhone app at the live backend (2 min)</w:t>
       </w:r>
     </w:p>
     <w:p>
@@ -214,7 +127,43 @@
         <w:pStyle w:val="ListBullet"/>
       </w:pPr>
       <w:r>
-        <w:t>Scroll to the bottom and click "Save Changes"</w:t>
+        <w:t>In Xcode, open Constants.swift (left file list)</w:t>
+      </w:r>
+    </w:p>
+    <w:p>
+      <w:pPr>
+        <w:pStyle w:val="ListBullet"/>
+      </w:pPr>
+      <w:r>
+        <w:t>Find the line:  static let API_BASE_URL = "http://localhost:3001"</w:t>
+      </w:r>
+    </w:p>
+    <w:p>
+      <w:pPr>
+        <w:pStyle w:val="ListBullet"/>
+      </w:pPr>
+      <w:r>
+        <w:t>Change it to:</w:t>
+      </w:r>
+    </w:p>
+    <w:p>
+      <w:pPr>
+        <w:ind w:left="576"/>
+      </w:pPr>
+      <w:r>
+        <w:rPr>
+          <w:rFonts w:ascii="Courier New" w:hAnsi="Courier New"/>
+          <w:sz w:val="22"/>
+        </w:rPr>
+        <w:t>static let API_BASE_URL = "https://forgeiq-api.onrender.com"</w:t>
+      </w:r>
+    </w:p>
+    <w:p>
+      <w:pPr>
+        <w:pStyle w:val="ListBullet"/>
+      </w:pPr>
+      <w:r>
+        <w:t>Press Cmd+R to reinstall on your iPhone</w:t>
       </w:r>
     </w:p>
     <w:p/>
@@ -223,9 +172,9 @@
         <w:rPr>
           <w:b/>
           <w:color w:val="00C853"/>
-          <w:sz w:val="32"/>
+          <w:sz w:val="30"/>
         </w:rPr>
-        <w:t>STEP 3 — The proof run on your iPhone   (5 minutes)</w:t>
+        <w:t>STEP 3 — The proof run (3 min)</w:t>
       </w:r>
     </w:p>
     <w:p>
@@ -233,7 +182,7 @@
         <w:pStyle w:val="ListBullet"/>
       </w:pPr>
       <w:r>
-        <w:t>Open ForgeIQ on the phone and tap Sign In — it should work now</w:t>
+        <w:t>On the phone: tap Sign In — should work now</w:t>
       </w:r>
     </w:p>
     <w:p>
@@ -241,7 +190,18 @@
         <w:pStyle w:val="ListBullet"/>
       </w:pPr>
       <w:r>
-        <w:t>Tap the record button, talk for 15 seconds about anything, tap stop</w:t>
+        <w:t>Record 15 seconds, stop, watch the transcript appear</w:t>
+      </w:r>
+    </w:p>
+    <w:p/>
+    <w:p>
+      <w:r>
+        <w:rPr>
+          <w:b/>
+          <w:color w:val="00C853"/>
+          <w:sz w:val="30"/>
+        </w:rPr>
+        <w:t>LATER (only when you want AI summary / TTS / Pipedrive)</w:t>
       </w:r>
     </w:p>
     <w:p>
@@ -249,7 +209,7 @@
         <w:pStyle w:val="ListBullet"/>
       </w:pPr>
       <w:r>
-        <w:t>Watch the transcript appear, then tap AI Call Summary</w:t>
+        <w:t>render.com &gt; forgeiq-api &gt; Environment: replace the three values currently set to</w:t>
       </w:r>
     </w:p>
     <w:p>
@@ -257,18 +217,7 @@
         <w:pStyle w:val="ListBullet"/>
       </w:pPr>
       <w:r>
-        <w:t>Tap Log to Pipedrive and check the activity shows up in Pipedrive</w:t>
-      </w:r>
-    </w:p>
-    <w:p/>
-    <w:p>
-      <w:r>
-        <w:rPr>
-          <w:b/>
-          <w:color w:val="1F4E79"/>
-          <w:sz w:val="28"/>
-        </w:rPr>
-        <w:t>Housekeeping (when convenient)</w:t>
+        <w:t>"pending": ELEVEN_LABS_API_KEY, ANTHROPIC_API_KEY, PIPEDRIVE_API_TOKEN</w:t>
       </w:r>
     </w:p>
     <w:p>
@@ -276,15 +225,7 @@
         <w:pStyle w:val="ListBullet"/>
       </w:pPr>
       <w:r>
-        <w:t>Delete the Render API key you created today (render.com &gt; avatar &gt; Account Settings &gt; API Keys &gt; the one named like claude &gt; delete) — it was shared in chat and is no longer needed</w:t>
-      </w:r>
-    </w:p>
-    <w:p>
-      <w:pPr>
-        <w:pStyle w:val="ListBullet"/>
-      </w:pPr>
-      <w:r>
-        <w:t>Your Mac's local ForgeIQ code has work that is NOT backed up on GitHub — ask Claude to help push it when you have 10 minutes</w:t>
+        <w:t>Delete your Render API keys (avatar &gt; Account Settings &gt; API Keys) — no longer needed</w:t>
       </w:r>
     </w:p>
     <w:sectPr>

</xml_diff>